<commit_message>
chore: retirar del repositorio la guía de despliegue y los archivos de configuración de Git
- Se retira docs/DESPLIEGUE.md; lo esencial queda en la sección 21 de la Ficha
  Maestra y en supabase/README.md (orden de instalación).
- .gitignore y .gitattributes dejan de versionarse; sus reglas se mantienen
  localmente, por lo que la configuración local y los archivos internos siguen
  excluidos.
</commit_message>
<xml_diff>
--- a/docs/Ficha_Maestra_Sistema_Fundacion_Amor_de_Cuatro_Patas.docx
+++ b/docs/Ficha_Maestra_Sistema_Fundacion_Amor_de_Cuatro_Patas.docx
@@ -26123,27 +26123,6 @@
         <w:t>Supabase</w:t>
       </w:r>
       <w:proofErr w:type="spellEnd"/>
-      <w:r>
-        <w:t xml:space="preserve">. El procedimiento completo se describe en </w:t>
-      </w:r>
-      <w:proofErr w:type="spellStart"/>
-      <w:r>
-        <w:rPr>
-          <w:rFonts w:ascii="Consolas" w:eastAsia="Consolas" w:hAnsi="Consolas" w:cs="Consolas"/>
-          <w:sz w:val="20"/>
-          <w:szCs w:val="20"/>
-        </w:rPr>
-        <w:t>docs</w:t>
-      </w:r>
-      <w:proofErr w:type="spellEnd"/>
-      <w:r>
-        <w:rPr>
-          <w:rFonts w:ascii="Consolas" w:eastAsia="Consolas" w:hAnsi="Consolas" w:cs="Consolas"/>
-          <w:sz w:val="20"/>
-          <w:szCs w:val="20"/>
-        </w:rPr>
-        <w:t>/DESPLIEGUE.md</w:t>
-      </w:r>
       <w:r>
         <w:t>.</w:t>
       </w:r>

</xml_diff>

<commit_message>
docs: identidad visual y cuestionario de adopción en la Ficha Maestra
</commit_message>
<xml_diff>
--- a/docs/Ficha_Maestra_Sistema_Fundacion_Amor_de_Cuatro_Patas.docx
+++ b/docs/Ficha_Maestra_Sistema_Fundacion_Amor_de_Cuatro_Patas.docx
@@ -1149,7 +1149,7 @@
                 <w:sz w:val="19"/>
                 <w:szCs w:val="19"/>
               </w:rPr>
-              <w:t xml:space="preserve">Estado de esterilización de los animales rescatados (</w:t>
+              <w:t xml:space="preserve">Estado de esterilización de los animales rescatados, actualización de la identidad visual e importación del cuestionario de adopción (</w:t>
             </w:r>
             <w:r>
               <w:rPr>
@@ -1158,23 +1158,7 @@
                 <w:sz w:val="19"/>
                 <w:szCs w:val="19"/>
               </w:rPr>
-              <w:t xml:space="preserve">implementado</w:t>
-            </w:r>
-            <w:r>
-              <w:rPr>
-                <w:sz w:val="19"/>
-                <w:szCs w:val="19"/>
-              </w:rPr>
-              <w:t xml:space="preserve">); actualización de la identidad visual e importación de la ficha del adoptante (</w:t>
-            </w:r>
-            <w:r>
-              <w:rPr>
-                <w:b/>
-                <w:bCs/>
-                <w:sz w:val="19"/>
-                <w:szCs w:val="19"/>
-              </w:rPr>
-              <w:t xml:space="preserve">pendientes</w:t>
+              <w:t xml:space="preserve">implementados</w:t>
             </w:r>
             <w:r>
               <w:rPr>
@@ -1565,7 +1549,7 @@
         <w:jc w:val="both"/>
       </w:pPr>
       <w:r>
-        <w:t>Postulaciones, cuestionarios o puntajes de adoptantes, y cualquier selección automática.</w:t>
+        <w:t xml:space="preserve">Postulaciones, evaluación de las respuestas del cuestionario o puntajes de adoptantes, y cualquier selección automática (del cuestionario solo se importan los datos personales del adoptante).</w:t>
       </w:r>
     </w:p>
     <w:p>
@@ -9628,7 +9612,7 @@
                 <w:sz w:val="19"/>
                 <w:szCs w:val="19"/>
               </w:rPr>
-              <w:t xml:space="preserve">nombre, rut, telefono, email, direccion, observaciones</w:t>
+              <w:t xml:space="preserve">nombre, rut, telefono, email, direccion, edad, ocupacion, observaciones</w:t>
             </w:r>
           </w:p>
         </w:tc>
@@ -9654,7 +9638,7 @@
                 <w:sz w:val="19"/>
                 <w:szCs w:val="19"/>
               </w:rPr>
-              <w:t xml:space="preserve">rut UNIQUE (normalizado 12345678-9).</w:t>
+              <w:t xml:space="preserve">rut obligatorio y UNIQUE (normalizado 12345678-9); edad opcional con CHECK 18 a 110.</w:t>
             </w:r>
           </w:p>
         </w:tc>
@@ -17691,6 +17675,95 @@
           </w:p>
         </w:tc>
       </w:tr>
+      <w:tr>
+        <w:tblPrEx>
+          <w:tblCellMar>
+            <w:top w:w="0" w:type="dxa"/>
+            <w:bottom w:w="0" w:type="dxa"/>
+          </w:tblCellMar>
+        </w:tblPrEx>
+        <w:tc>
+          <w:tcPr>
+            <w:tcW w:w="1000" w:type="dxa"/>
+            <w:tcBorders>
+              <w:top w:val="single" w:sz="4" w:space="0" w:color="C9D6DB"/>
+              <w:left w:val="single" w:sz="4" w:space="0" w:color="C9D6DB"/>
+              <w:bottom w:val="single" w:sz="4" w:space="0" w:color="C9D6DB"/>
+              <w:right w:val="single" w:sz="4" w:space="0" w:color="C9D6DB"/>
+            </w:tcBorders>
+            <w:tcMar>
+              <w:top w:w="60" w:type="dxa"/>
+              <w:left w:w="100" w:type="dxa"/>
+              <w:bottom w:w="60" w:type="dxa"/>
+              <w:right w:w="100" w:type="dxa"/>
+            </w:tcMar>
+          </w:tcPr>
+          <w:p>
+            <w:r>
+              <w:rPr>
+                <w:sz w:val="19"/>
+                <w:szCs w:val="19"/>
+              </w:rPr>
+              <w:t xml:space="preserve">RN-67</w:t>
+            </w:r>
+          </w:p>
+        </w:tc>
+        <w:tc>
+          <w:tcPr>
+            <w:tcW w:w="3756" w:type="dxa"/>
+            <w:tcBorders>
+              <w:top w:val="single" w:sz="4" w:space="0" w:color="C9D6DB"/>
+              <w:left w:val="single" w:sz="4" w:space="0" w:color="C9D6DB"/>
+              <w:bottom w:val="single" w:sz="4" w:space="0" w:color="C9D6DB"/>
+              <w:right w:val="single" w:sz="4" w:space="0" w:color="C9D6DB"/>
+            </w:tcBorders>
+            <w:tcMar>
+              <w:top w:w="60" w:type="dxa"/>
+              <w:left w:w="100" w:type="dxa"/>
+              <w:bottom w:w="60" w:type="dxa"/>
+              <w:right w:w="100" w:type="dxa"/>
+            </w:tcMar>
+          </w:tcPr>
+          <w:p>
+            <w:pPr>
+              <w:jc w:val="both"/>
+            </w:pPr>
+            <w:r>
+              <w:rPr>
+                <w:sz w:val="19"/>
+                <w:szCs w:val="19"/>
+              </w:rPr>
+              <w:t xml:space="preserve">El adoptante debe ser mayor de edad; su edad y ocupación son opcionales y pueden provenir del cuestionario de adopción. El RUT identifica al adoptante: al importar un cuestionario con un RUT ya registrado se selecciona a ese adoptante en lugar de crear otro.</w:t>
+            </w:r>
+          </w:p>
+        </w:tc>
+        <w:tc>
+          <w:tcPr>
+            <w:tcW w:w="4270" w:type="dxa"/>
+            <w:tcBorders>
+              <w:top w:val="single" w:sz="4" w:space="0" w:color="C9D6DB"/>
+              <w:left w:val="single" w:sz="4" w:space="0" w:color="C9D6DB"/>
+              <w:bottom w:val="single" w:sz="4" w:space="0" w:color="C9D6DB"/>
+              <w:right w:val="single" w:sz="4" w:space="0" w:color="C9D6DB"/>
+            </w:tcBorders>
+            <w:tcMar>
+              <w:top w:w="60" w:type="dxa"/>
+              <w:left w:w="100" w:type="dxa"/>
+              <w:bottom w:w="60" w:type="dxa"/>
+              <w:right w:w="100" w:type="dxa"/>
+            </w:tcMar>
+          </w:tcPr>
+          <w:p>
+            <w:r>
+              <w:rPr>
+                <w:sz w:val="19"/>
+                <w:szCs w:val="19"/>
+              </w:rPr>
+              <w:t xml:space="preserve">CHECK de edad 18 a 110 y UNIQUE de RUT en ADOPTANTE (script de seguridad 13); reconocimiento por RUT normalizado en el frontend.</w:t>
+            </w:r>
+          </w:p>
+        </w:tc>
+      </w:tr>
     </w:tbl>
     <w:p>
       <w:pPr>
@@ -19369,6 +19442,95 @@
           </w:p>
         </w:tc>
       </w:tr>
+      <w:tr>
+        <w:tblPrEx>
+          <w:tblCellMar>
+            <w:top w:w="0" w:type="dxa"/>
+            <w:bottom w:w="0" w:type="dxa"/>
+          </w:tblCellMar>
+        </w:tblPrEx>
+        <w:tc>
+          <w:tcPr>
+            <w:tcW w:w="1000" w:type="dxa"/>
+            <w:tcBorders>
+              <w:top w:val="single" w:sz="4" w:space="0" w:color="C9D6DB"/>
+              <w:left w:val="single" w:sz="4" w:space="0" w:color="C9D6DB"/>
+              <w:bottom w:val="single" w:sz="4" w:space="0" w:color="C9D6DB"/>
+              <w:right w:val="single" w:sz="4" w:space="0" w:color="C9D6DB"/>
+            </w:tcBorders>
+            <w:tcMar>
+              <w:top w:w="60" w:type="dxa"/>
+              <w:left w:w="100" w:type="dxa"/>
+              <w:bottom w:w="60" w:type="dxa"/>
+              <w:right w:w="100" w:type="dxa"/>
+            </w:tcMar>
+          </w:tcPr>
+          <w:p>
+            <w:r>
+              <w:rPr>
+                <w:sz w:val="19"/>
+                <w:szCs w:val="19"/>
+              </w:rPr>
+              <w:t xml:space="preserve">13 / 14</w:t>
+            </w:r>
+          </w:p>
+        </w:tc>
+        <w:tc>
+          <w:tcPr>
+            <w:tcW w:w="6822" w:type="dxa"/>
+            <w:tcBorders>
+              <w:top w:val="single" w:sz="4" w:space="0" w:color="C9D6DB"/>
+              <w:left w:val="single" w:sz="4" w:space="0" w:color="C9D6DB"/>
+              <w:bottom w:val="single" w:sz="4" w:space="0" w:color="C9D6DB"/>
+              <w:right w:val="single" w:sz="4" w:space="0" w:color="C9D6DB"/>
+            </w:tcBorders>
+            <w:tcMar>
+              <w:top w:w="60" w:type="dxa"/>
+              <w:left w:w="100" w:type="dxa"/>
+              <w:bottom w:w="60" w:type="dxa"/>
+              <w:right w:w="100" w:type="dxa"/>
+            </w:tcMar>
+          </w:tcPr>
+          <w:p>
+            <w:pPr>
+              <w:jc w:val="both"/>
+            </w:pPr>
+            <w:r>
+              <w:rPr>
+                <w:sz w:val="19"/>
+                <w:szCs w:val="19"/>
+              </w:rPr>
+              <w:t xml:space="preserve">Edad (CHECK 18 a 110) y ocupación opcionales del adoptante. El RUT sigue obligatorio y único; los permisos existentes sobre la tabla cubren las columnas nuevas.</w:t>
+            </w:r>
+          </w:p>
+        </w:tc>
+        <w:tc>
+          <w:tcPr>
+            <w:tcW w:w="1204" w:type="dxa"/>
+            <w:tcBorders>
+              <w:top w:val="single" w:sz="4" w:space="0" w:color="C9D6DB"/>
+              <w:left w:val="single" w:sz="4" w:space="0" w:color="C9D6DB"/>
+              <w:bottom w:val="single" w:sz="4" w:space="0" w:color="C9D6DB"/>
+              <w:right w:val="single" w:sz="4" w:space="0" w:color="C9D6DB"/>
+            </w:tcBorders>
+            <w:tcMar>
+              <w:top w:w="60" w:type="dxa"/>
+              <w:left w:w="100" w:type="dxa"/>
+              <w:bottom w:w="60" w:type="dxa"/>
+              <w:right w:w="100" w:type="dxa"/>
+            </w:tcMar>
+          </w:tcPr>
+          <w:p>
+            <w:r>
+              <w:rPr>
+                <w:sz w:val="19"/>
+                <w:szCs w:val="19"/>
+              </w:rPr>
+              <w:t xml:space="preserve">14</w:t>
+            </w:r>
+          </w:p>
+        </w:tc>
+      </w:tr>
     </w:tbl>
     <w:p>
       <w:pPr>
@@ -21594,7 +21756,7 @@
                 <w:sz w:val="19"/>
                 <w:szCs w:val="19"/>
               </w:rPr>
-              <w:t>Adoptantes (RUT normalizado y validado), registro de adopción desde el módulo o la ficha, seguimientos, devolución y documentos de la adopción.</w:t>
+              <w:t xml:space="preserve">Adoptantes (RUT normalizado y validado, edad y ocupación), importación del cuestionario de adopción en Word que rellena los datos del adoptante y se guarda como documento de la adopción, registro de adopción desde el módulo o la ficha, seguimientos, devolución y documentos de la adopción.</w:t>
             </w:r>
           </w:p>
         </w:tc>
@@ -22283,10 +22445,10 @@
           <w:b/>
           <w:bCs/>
         </w:rPr>
-        <w:t>Accesibilidad y uso en celular.</w:t>
-      </w:r>
-      <w:r>
-        <w:t xml:space="preserve"> Contraste AA, foco visible y retorno del foco al cerrar modales, enlace "Saltar al contenido", tablas apiladas y filtros plegables en pantallas pequeñas.</w:t>
+        <w:t xml:space="preserve">Lectura del cuestionario de adopción.</w:t>
+      </w:r>
+      <w:r>
+        <w:t xml:space="preserve"> El documento Word (.docx) se lee en el navegador con DecompressionStream, sin librerías externas ni envío a otros servicios; se toma solo la tabla de datos del adoptante (celdas "Etiqueta: valor") y la usuaria revisa los datos antes de guardarlos.</w:t>
       </w:r>
     </w:p>
     <w:p>
@@ -22304,10 +22466,31 @@
           <w:b/>
           <w:bCs/>
         </w:rPr>
-        <w:t>Identidad visual.</w:t>
-      </w:r>
-      <w:r>
-        <w:t xml:space="preserve"> Menú lateral azul petróleo, superficies claras, fucsia de la Fundación como acento y colores semánticos para estados. Existe un espacio reemplazable para el logo oficial, que aún no se ha incorporado.</w:t>
+        <w:t>Accesibilidad y uso en celular.</w:t>
+      </w:r>
+      <w:r>
+        <w:t xml:space="preserve"> Contraste AA, foco visible y retorno del foco al cerrar modales, enlace "Saltar al contenido", tablas apiladas y filtros plegables en pantallas pequeñas.</w:t>
+      </w:r>
+    </w:p>
+    <w:p>
+      <w:pPr>
+        <w:pStyle w:val="Prrafodelista"/>
+        <w:numPr>
+          <w:ilvl w:val="0"/>
+          <w:numId w:val="2"/>
+        </w:numPr>
+        <w:spacing w:after="60"/>
+        <w:jc w:val="both"/>
+      </w:pPr>
+      <w:r>
+        <w:rPr>
+          <w:b/>
+          <w:bCs/>
+        </w:rPr>
+        <w:t xml:space="preserve">Identidad visual.</w:t>
+      </w:r>
+      <w:r>
+        <w:t xml:space="preserve"> Logo oficial de la Fundación sobre una placa blanca en el menú lateral y en el ingreso; menú lateral y botones en el burdeo del logo, fondos cálidos claros, el rosado del logo solo como acento y colores semánticos para estados (el rojo de error se distingue del burdeo). Los contrastes cumplen WCAG AA.</w:t>
       </w:r>
     </w:p>
     <w:p>
@@ -22629,7 +22812,7 @@
                 <w:sz w:val="19"/>
                 <w:szCs w:val="19"/>
               </w:rPr>
-              <w:t xml:space="preserve">116 pruebas con </w:t>
+              <w:t xml:space="preserve">127 pruebas con </w:t>
             </w:r>
             <w:r>
               <w:rPr>
@@ -22644,7 +22827,7 @@
                 <w:sz w:val="19"/>
                 <w:szCs w:val="19"/>
               </w:rPr>
-              <w:t xml:space="preserve"> sobre la lógica del frontend: formato y RUT, errores, router, sesión con cliente simulado, lógica de cada módulo, informes, configuración, generación de la configuración y coherencia entre los permisos de los scripts 09 y 11 y las columnas que escribe el frontend.</w:t>
+              <w:t xml:space="preserve"> sobre la lógica del frontend: formato y RUT, lectura de documentos Word, errores, router, sesión con cliente simulado, lógica de cada módulo, informes, configuración, generación de la configuración y coherencia entre los permisos de los scripts 09 y 11 y las columnas que escribe el frontend.</w:t>
             </w:r>
           </w:p>
         </w:tc>
@@ -22704,7 +22887,7 @@
                 <w:sz w:val="19"/>
                 <w:szCs w:val="19"/>
               </w:rPr>
-              <w:t xml:space="preserve">Scripts SQL de verificación (02, 04, 06, 08, 10 y 12) que simulan una usuaria activa y el rol anónimo, comprueban cada regla y revierten todos los cambios.</w:t>
+              <w:t xml:space="preserve">Scripts SQL de verificación (02, 04, 06, 08, 10, 12 y 14) que simulan una usuaria activa y el rol anónimo, comprueban cada regla y revierten todos los cambios.</w:t>
             </w:r>
           </w:p>
         </w:tc>
@@ -22989,7 +23172,7 @@
         <w:jc w:val="both"/>
       </w:pPr>
       <w:r>
-        <w:t xml:space="preserve">Con posterioridad a la implementación, la Fundación solicitó tres mejoras. Su estado a la fecha de este documento es el siguiente:</w:t>
+        <w:t xml:space="preserve">Con posterioridad a la implementación, la Fundación solicitó tres mejoras, que se encuentran implementadas:</w:t>
       </w:r>
     </w:p>
     <w:tbl>
@@ -23205,10 +23388,19 @@
           <w:p>
             <w:r>
               <w:rPr>
-                <w:sz w:val="19"/>
-                <w:szCs w:val="19"/>
-              </w:rPr>
-              <w:t>Pendiente. La interfaz ya dispone de un espacio reemplazable para el logo oficial.</w:t>
+                <w:b/>
+                <w:bCs/>
+                <w:sz w:val="19"/>
+                <w:szCs w:val="19"/>
+              </w:rPr>
+              <w:t xml:space="preserve">Implementado.</w:t>
+            </w:r>
+            <w:r>
+              <w:rPr>
+                <w:sz w:val="19"/>
+                <w:szCs w:val="19"/>
+              </w:rPr>
+              <w:t xml:space="preserve"> Logo oficial en el menú lateral, el ingreso y el ícono del navegador, y paleta basada en sus colores: burdeo para la estructura y rosado como acento (sección 20).</w:t>
             </w:r>
           </w:p>
         </w:tc>
@@ -23265,10 +23457,19 @@
           <w:p>
             <w:r>
               <w:rPr>
-                <w:sz w:val="19"/>
-                <w:szCs w:val="19"/>
-              </w:rPr>
-              <w:t>Pendiente. Requiere definir el formato de origen de la ficha.</w:t>
+                <w:b/>
+                <w:bCs/>
+                <w:sz w:val="19"/>
+                <w:szCs w:val="19"/>
+              </w:rPr>
+              <w:t xml:space="preserve">Implementado.</w:t>
+            </w:r>
+            <w:r>
+              <w:rPr>
+                <w:sz w:val="19"/>
+                <w:szCs w:val="19"/>
+              </w:rPr>
+              <w:t xml:space="preserve"> La ficha corresponde al cuestionario de adopción en Word (.docx). Al registrar una adopción, el sistema lee la tabla de datos del adoptante (nombre, RUT, dirección, teléfono, correo, edad y ocupación) y rellena su ficha para revisión; si el RUT ya existe, selecciona a ese adoptante y ofrece actualizar sus datos. El documento se guarda en Drive como documento de la adopción. Se agregaron la edad y la ocupación del adoptante (RN-67, script 13).</w:t>
             </w:r>
           </w:p>
         </w:tc>

</xml_diff>